<commit_message>
Adding NoSQL data structure and ERD
</commit_message>
<xml_diff>
--- a/module-2/gordon_module2_2.docx
+++ b/module-2/gordon_module2_2.docx
@@ -8,14 +8,25 @@
         <w:jc w:val="center"/>
         <w:rPr>
           <w:rFonts w:ascii="Arial" w:hAnsi="Arial" w:cs="Arial"/>
-        </w:rPr>
-      </w:pPr>
-      <w:r>
-        <w:rPr>
-          <w:rFonts w:ascii="Arial" w:hAnsi="Arial" w:cs="Arial"/>
-        </w:rPr>
-        <w:t>Visual Paradigm</w:t>
-      </w:r>
+          <w:lang w:val="es-ES"/>
+        </w:rPr>
+      </w:pPr>
+      <w:r>
+        <w:rPr>
+          <w:rFonts w:ascii="Arial" w:hAnsi="Arial" w:cs="Arial"/>
+          <w:lang w:val="es-ES"/>
+        </w:rPr>
+        <w:t xml:space="preserve">Visual </w:t>
+      </w:r>
+      <w:proofErr w:type="spellStart"/>
+      <w:r>
+        <w:rPr>
+          <w:rFonts w:ascii="Arial" w:hAnsi="Arial" w:cs="Arial"/>
+          <w:lang w:val="es-ES"/>
+        </w:rPr>
+        <w:t>Paradigm</w:t>
+      </w:r>
+      <w:proofErr w:type="spellEnd"/>
     </w:p>
     <w:p>
       <w:pPr>
@@ -23,13 +34,13 @@
         <w:jc w:val="center"/>
         <w:rPr>
           <w:rFonts w:ascii="Arial" w:hAnsi="Arial" w:cs="Arial"/>
-          <w:lang w:val="fr-FR"/>
-        </w:rPr>
-      </w:pPr>
-      <w:r>
-        <w:rPr>
-          <w:rFonts w:ascii="Arial" w:hAnsi="Arial" w:cs="Arial"/>
-          <w:lang w:val="fr-FR"/>
+          <w:lang w:val="es-ES"/>
+        </w:rPr>
+      </w:pPr>
+      <w:r>
+        <w:rPr>
+          <w:rFonts w:ascii="Arial" w:hAnsi="Arial" w:cs="Arial"/>
+          <w:lang w:val="es-ES"/>
         </w:rPr>
         <w:t>Michael Gordon</w:t>
       </w:r>
@@ -40,13 +51,13 @@
         <w:jc w:val="center"/>
         <w:rPr>
           <w:rFonts w:ascii="Arial" w:hAnsi="Arial" w:cs="Arial"/>
-          <w:lang w:val="fr-FR"/>
-        </w:rPr>
-      </w:pPr>
-      <w:r>
-        <w:rPr>
-          <w:rFonts w:ascii="Arial" w:hAnsi="Arial" w:cs="Arial"/>
-          <w:lang w:val="fr-FR"/>
+          <w:lang w:val="es-ES"/>
+        </w:rPr>
+      </w:pPr>
+      <w:r>
+        <w:rPr>
+          <w:rFonts w:ascii="Arial" w:hAnsi="Arial" w:cs="Arial"/>
+          <w:lang w:val="es-ES"/>
         </w:rPr>
         <w:t xml:space="preserve">Bellevue </w:t>
       </w:r>
@@ -54,7 +65,7 @@
       <w:r>
         <w:rPr>
           <w:rFonts w:ascii="Arial" w:hAnsi="Arial" w:cs="Arial"/>
-          <w:lang w:val="fr-FR"/>
+          <w:lang w:val="es-ES"/>
         </w:rPr>
         <w:t>University</w:t>
       </w:r>
@@ -94,14 +105,14 @@
         <w:rPr>
           <w:rFonts w:ascii="Arial" w:hAnsi="Arial" w:cs="Arial"/>
         </w:rPr>
-        <w:t>Morto</w:t>
+        <w:t>Mortoza</w:t>
       </w:r>
       <w:proofErr w:type="spellEnd"/>
       <w:r>
         <w:rPr>
           <w:rFonts w:ascii="Arial" w:hAnsi="Arial" w:cs="Arial"/>
         </w:rPr>
-        <w:t>za Abdullah</w:t>
+        <w:t xml:space="preserve"> Abdullah</w:t>
       </w:r>
     </w:p>
     <w:p>
@@ -267,7 +278,19 @@
         <w:rPr>
           <w:rFonts w:ascii="Arial" w:hAnsi="Arial" w:cs="Arial"/>
         </w:rPr>
-        <w:t>Books can have many Authors and Authors can have many Books – many to many</w:t>
+        <w:t xml:space="preserve">Books can have many Authors – </w:t>
+      </w:r>
+      <w:r>
+        <w:rPr>
+          <w:rFonts w:ascii="Arial" w:hAnsi="Arial" w:cs="Arial"/>
+        </w:rPr>
+        <w:t>one</w:t>
+      </w:r>
+      <w:r>
+        <w:rPr>
+          <w:rFonts w:ascii="Arial" w:hAnsi="Arial" w:cs="Arial"/>
+        </w:rPr>
+        <w:t xml:space="preserve"> to many</w:t>
       </w:r>
     </w:p>
     <w:p>
@@ -283,10 +306,10 @@
           <w:rFonts w:ascii="Arial" w:hAnsi="Arial" w:cs="Arial"/>
         </w:rPr>
         <w:drawing>
-          <wp:inline distT="0" distB="0" distL="0" distR="0" wp14:anchorId="74955850" wp14:editId="6C1D5702">
-            <wp:extent cx="5943600" cy="4674870"/>
+          <wp:inline distT="0" distB="0" distL="0" distR="0" wp14:anchorId="6BD66AC1" wp14:editId="0834C55D">
+            <wp:extent cx="5943600" cy="3930650"/>
             <wp:effectExtent l="0" t="0" r="0" b="0"/>
-            <wp:docPr id="650484351" name="Picture 1"/>
+            <wp:docPr id="1114715421" name="Picture 1"/>
             <wp:cNvGraphicFramePr>
               <a:graphicFrameLocks xmlns:a="http://schemas.openxmlformats.org/drawingml/2006/main" noChangeAspect="1"/>
             </wp:cNvGraphicFramePr>
@@ -294,7 +317,7 @@
               <a:graphicData uri="http://schemas.openxmlformats.org/drawingml/2006/picture">
                 <pic:pic xmlns:pic="http://schemas.openxmlformats.org/drawingml/2006/picture">
                   <pic:nvPicPr>
-                    <pic:cNvPr id="650484351" name=""/>
+                    <pic:cNvPr id="1114715421" name=""/>
                     <pic:cNvPicPr/>
                   </pic:nvPicPr>
                   <pic:blipFill>
@@ -306,7 +329,7 @@
                   <pic:spPr>
                     <a:xfrm>
                       <a:off x="0" y="0"/>
-                      <a:ext cx="5943600" cy="4674870"/>
+                      <a:ext cx="5943600" cy="3930650"/>
                     </a:xfrm>
                     <a:prstGeom prst="rect">
                       <a:avLst/>
@@ -934,6 +957,7 @@
   <w:style w:type="character" w:default="1" w:styleId="DefaultParagraphFont">
     <w:name w:val="Default Paragraph Font"/>
     <w:uiPriority w:val="1"/>
+    <w:semiHidden/>
     <w:unhideWhenUsed/>
   </w:style>
   <w:style w:type="table" w:default="1" w:styleId="TableNormal">

</xml_diff>